<commit_message>
v1.0.2 — update user manual: version bump and credits appendix
- Version updated from 1.0.1 to 1.0.2 throughout
- Added Appendix C: Credits and Acknowledgements — developer (Jeffrey Leal),
  AI assistance (Claude Sonnet 4.6 / Anthropic), DICOM standard reference
  (NEMA PS3 2024b), and open-source library table with licences

Co-Authored-By: Claude Sonnet 4.6 <noreply@anthropic.com>
</commit_message>
<xml_diff>
--- a/dicomhdr-user-manual.docx
+++ b/dicomhdr-user-manual.docx
@@ -12,7 +12,7 @@
     </w:p>
     <w:p>
       <w:r>
-        <w:t xml:space="preserve">Version 1.0.1</w:t>
+        <w:t>Version 1.0.2</w:t>
       </w:r>
     </w:p>
     <w:p/>
@@ -2182,7 +2182,7 @@
           <w:b/>
           <w:bCs/>
         </w:rPr>
-        <w:t xml:space="preserve">v1.0.1</w:t>
+        <w:t>v1.0.2</w:t>
       </w:r>
       <w:r>
         <w:t xml:space="preserve"> when no files are loaded. After files have been opened, this changes to </w:t>
@@ -5582,6 +5582,264 @@
       </w:tr>
     </w:tbl>
     <w:p/>
+    <w:p>
+      <w:pPr>
+        <w:pStyle w:val="Heading1"/>
+      </w:pPr>
+      <w:r>
+        <w:t>Appendix C: Credits and Acknowledgements</w:t>
+      </w:r>
+    </w:p>
+    <w:p>
+      <w:pPr>
+        <w:pStyle w:val="Heading2"/>
+      </w:pPr>
+      <w:r>
+        <w:t>Developer</w:t>
+      </w:r>
+    </w:p>
+    <w:p>
+      <w:r>
+        <w:t>dicomhdr was written by Jeffrey Leal (jeffrey.leal@gmail.com, https://github.com/jeffrey-leal).</w:t>
+      </w:r>
+    </w:p>
+    <w:p>
+      <w:pPr>
+        <w:pStyle w:val="Heading2"/>
+      </w:pPr>
+      <w:r>
+        <w:t>AI Assistance</w:t>
+      </w:r>
+    </w:p>
+    <w:p>
+      <w:r>
+        <w:t>This application was designed and developed with the assistance of Claude Sonnet 4.6, an AI assistant created by Anthropic (https://anthropic.com). Architecture planning, code generation, DICOM standard research, and documentation were produced in collaboration with Claude Code.</w:t>
+      </w:r>
+    </w:p>
+    <w:p>
+      <w:pPr>
+        <w:pStyle w:val="Heading2"/>
+      </w:pPr>
+      <w:r>
+        <w:t>DICOM Standard Reference</w:t>
+      </w:r>
+    </w:p>
+    <w:p>
+      <w:r>
+        <w:t>Implementation follows the DICOM Standard published by NEMA: DICOM PS3 (2024b) — https://dicom.nema.org/medical/dicom/current</w:t>
+      </w:r>
+    </w:p>
+    <w:p>
+      <w:pPr>
+        <w:pStyle w:val="Heading2"/>
+      </w:pPr>
+      <w:r>
+        <w:t>Open-Source Libraries</w:t>
+      </w:r>
+    </w:p>
+    <w:p>
+      <w:r>
+        <w:t>dicomhdr is built on the following open-source projects:</w:t>
+      </w:r>
+    </w:p>
+    <w:tbl>
+      <w:tblPr>
+        <w:tblStyle w:val="TableGrid"/>
+        <w:tblW w:type="auto" w:w="0"/>
+        <w:tblLook w:firstColumn="1" w:firstRow="1" w:lastColumn="0" w:lastRow="0" w:noHBand="0" w:noVBand="1" w:val="04A0"/>
+      </w:tblPr>
+      <w:tblGrid>
+        <w:gridCol w:w="2340"/>
+        <w:gridCol w:w="2340"/>
+        <w:gridCol w:w="2340"/>
+        <w:gridCol w:w="2340"/>
+      </w:tblGrid>
+      <w:tr>
+        <w:tc>
+          <w:tcPr>
+            <w:tcW w:type="dxa" w:w="2340"/>
+          </w:tcPr>
+          <w:p>
+            <w:r>
+              <w:rPr>
+                <w:b/>
+              </w:rPr>
+              <w:t>Library</w:t>
+            </w:r>
+          </w:p>
+        </w:tc>
+        <w:tc>
+          <w:tcPr>
+            <w:tcW w:type="dxa" w:w="2340"/>
+          </w:tcPr>
+          <w:p>
+            <w:r>
+              <w:rPr>
+                <w:b/>
+              </w:rPr>
+              <w:t>Repository</w:t>
+            </w:r>
+          </w:p>
+        </w:tc>
+        <w:tc>
+          <w:tcPr>
+            <w:tcW w:type="dxa" w:w="2340"/>
+          </w:tcPr>
+          <w:p>
+            <w:r>
+              <w:rPr>
+                <w:b/>
+              </w:rPr>
+              <w:t>Licence</w:t>
+            </w:r>
+          </w:p>
+        </w:tc>
+        <w:tc>
+          <w:tcPr>
+            <w:tcW w:type="dxa" w:w="2340"/>
+          </w:tcPr>
+          <w:p>
+            <w:r>
+              <w:rPr>
+                <w:b/>
+              </w:rPr>
+              <w:t>Purpose</w:t>
+            </w:r>
+          </w:p>
+        </w:tc>
+      </w:tr>
+      <w:tr>
+        <w:tc>
+          <w:tcPr>
+            <w:tcW w:type="dxa" w:w="2340"/>
+          </w:tcPr>
+          <w:p>
+            <w:r>
+              <w:t>fyne.io/fyne/v2  v2.7.3</w:t>
+            </w:r>
+          </w:p>
+        </w:tc>
+        <w:tc>
+          <w:tcPr>
+            <w:tcW w:type="dxa" w:w="2340"/>
+          </w:tcPr>
+          <w:p>
+            <w:r>
+              <w:t>fyne.io/fyne/v2</w:t>
+            </w:r>
+          </w:p>
+        </w:tc>
+        <w:tc>
+          <w:tcPr>
+            <w:tcW w:type="dxa" w:w="2340"/>
+          </w:tcPr>
+          <w:p>
+            <w:r>
+              <w:t>BSD 3-Clause</w:t>
+            </w:r>
+          </w:p>
+        </w:tc>
+        <w:tc>
+          <w:tcPr>
+            <w:tcW w:type="dxa" w:w="2340"/>
+          </w:tcPr>
+          <w:p>
+            <w:r>
+              <w:t>GUI framework</w:t>
+            </w:r>
+          </w:p>
+        </w:tc>
+      </w:tr>
+      <w:tr>
+        <w:tc>
+          <w:tcPr>
+            <w:tcW w:type="dxa" w:w="2340"/>
+          </w:tcPr>
+          <w:p>
+            <w:r>
+              <w:t>suyashkumar/dicom  v1.1.0</w:t>
+            </w:r>
+          </w:p>
+        </w:tc>
+        <w:tc>
+          <w:tcPr>
+            <w:tcW w:type="dxa" w:w="2340"/>
+          </w:tcPr>
+          <w:p>
+            <w:r>
+              <w:t>github.com/suyashkumar/dicom</w:t>
+            </w:r>
+          </w:p>
+        </w:tc>
+        <w:tc>
+          <w:tcPr>
+            <w:tcW w:type="dxa" w:w="2340"/>
+          </w:tcPr>
+          <w:p>
+            <w:r>
+              <w:t>MIT</w:t>
+            </w:r>
+          </w:p>
+        </w:tc>
+        <w:tc>
+          <w:tcPr>
+            <w:tcW w:type="dxa" w:w="2340"/>
+          </w:tcPr>
+          <w:p>
+            <w:r>
+              <w:t>DICOM file parsing and data dictionary</w:t>
+            </w:r>
+          </w:p>
+        </w:tc>
+      </w:tr>
+      <w:tr>
+        <w:tc>
+          <w:tcPr>
+            <w:tcW w:type="dxa" w:w="2340"/>
+          </w:tcPr>
+          <w:p>
+            <w:r>
+              <w:t>sqweek/dialog</w:t>
+            </w:r>
+          </w:p>
+        </w:tc>
+        <w:tc>
+          <w:tcPr>
+            <w:tcW w:type="dxa" w:w="2340"/>
+          </w:tcPr>
+          <w:p>
+            <w:r>
+              <w:t>github.com/sqweek/dialog</w:t>
+            </w:r>
+          </w:p>
+        </w:tc>
+        <w:tc>
+          <w:tcPr>
+            <w:tcW w:type="dxa" w:w="2340"/>
+          </w:tcPr>
+          <w:p>
+            <w:r>
+              <w:t>ISC</w:t>
+            </w:r>
+          </w:p>
+        </w:tc>
+        <w:tc>
+          <w:tcPr>
+            <w:tcW w:type="dxa" w:w="2340"/>
+          </w:tcPr>
+          <w:p>
+            <w:r>
+              <w:t>Native Windows file/folder picker dialogs</w:t>
+            </w:r>
+          </w:p>
+        </w:tc>
+      </w:tr>
+    </w:tbl>
+    <w:p>
+      <w:r>
+        <w:t>All libraries are used under their respective open-source licences.</w:t>
+      </w:r>
+    </w:p>
     <w:sectPr>
       <w:pgSz w:w="12240" w:h="15840"/>
       <w:pgMar w:top="1440" w:right="1440" w:bottom="1440" w:left="1440" w:header="708" w:footer="708" w:gutter="0"/>

</xml_diff>

<commit_message>
v1.0.6 — fix Collapse All leaving the tree blank when scrolled down
CloseAllBranches does not clamp the scroll offset, so collapsing while the
tree was scrolled down left the viewport parked past the end of the now-shorter
content, showing nothing with no way to scroll back up. Collapse All now resets
the scroll to the top first.

Also update CHANGELOG.md and the user manual.

Co-Authored-By: Claude Opus 4.8 <noreply@anthropic.com>
</commit_message>
<xml_diff>
--- a/dicomhdr-user-manual.docx
+++ b/dicomhdr-user-manual.docx
@@ -12,7 +12,7 @@
     </w:p>
     <w:p>
       <w:r>
-        <w:t>Version 1.0.5</w:t>
+        <w:t>Version 1.0.6</w:t>
       </w:r>
     </w:p>
     <w:p/>
@@ -2220,7 +2220,7 @@
           <w:b/>
           <w:bCs/>
         </w:rPr>
-        <w:t>v1.0.5</w:t>
+        <w:t>v1.0.6</w:t>
       </w:r>
       <w:r>
         <w:t xml:space="preserve"> when no files are loaded. After files have been opened, this changes to </w:t>

</xml_diff>

<commit_message>
Reformat user manual to dicomtool layout; document in CHANGELOG
- Title page: DICOMHdr logo, application name, manual version, build date, a
  one-line description, and the IRAT / Johns Hopkins address block, centred
  both horizontally and vertically.
- Running header (dicomhdr / Page N, bottom border) and footer (IRAT / NIH-NCI
  grant acknowledgment, top border) on the body pages; the title page has
  neither.
- CHANGELOG: documentation note under 1.0.6.

Co-Authored-By: Claude Opus 4.8 <noreply@anthropic.com>
</commit_message>
<xml_diff>
--- a/dicomhdr-user-manual.docx
+++ b/dicomhdr-user-manual.docx
@@ -4,18 +4,142 @@
   <w:body>
     <w:p>
       <w:pPr>
-        <w:pStyle w:val="Heading1"/>
-      </w:pPr>
-      <w:r>
-        <w:t xml:space="preserve">dicomhdr User Manual</w:t>
-      </w:r>
-    </w:p>
-    <w:p>
-      <w:r>
-        <w:t>Version 1.0.6</w:t>
-      </w:r>
-    </w:p>
-    <w:p/>
+        <w:jc w:val="center"/>
+      </w:pPr>
+      <w:r>
+        <w:drawing>
+          <wp:inline xmlns:wp="http://schemas.openxmlformats.org/drawingml/2006/wordprocessingDrawing" xmlns:a="http://schemas.openxmlformats.org/drawingml/2006/main" xmlns:pic="http://schemas.openxmlformats.org/drawingml/2006/picture">
+            <wp:extent cx="2286000" cy="2286000"/>
+            <wp:docPr id="1" name="Picture 1"/>
+            <wp:cNvGraphicFramePr>
+              <a:graphicFrameLocks noChangeAspect="1"/>
+            </wp:cNvGraphicFramePr>
+            <a:graphic>
+              <a:graphicData uri="http://schemas.openxmlformats.org/drawingml/2006/picture">
+                <pic:pic>
+                  <pic:nvPicPr>
+                    <pic:cNvPr id="0" name="DICOMHdr Logo.png"/>
+                    <pic:cNvPicPr/>
+                  </pic:nvPicPr>
+                  <pic:blipFill>
+                    <a:blip r:embed="rId4"/>
+                    <a:stretch>
+                      <a:fillRect/>
+                    </a:stretch>
+                  </pic:blipFill>
+                  <pic:spPr>
+                    <a:xfrm>
+                      <a:off x="0" y="0"/>
+                      <a:ext cx="2286000" cy="2286000"/>
+                    </a:xfrm>
+                    <a:prstGeom prst="rect"/>
+                  </pic:spPr>
+                </pic:pic>
+              </a:graphicData>
+            </a:graphic>
+          </wp:inline>
+        </w:drawing>
+      </w:r>
+    </w:p>
+    <w:p>
+      <w:pPr>
+        <w:jc w:val="center"/>
+      </w:pPr>
+      <w:r>
+        <w:rPr>
+          <w:b/>
+          <w:sz w:val="72"/>
+        </w:rPr>
+        <w:t>dicomhdr</w:t>
+      </w:r>
+    </w:p>
+    <w:p>
+      <w:pPr>
+        <w:jc w:val="center"/>
+      </w:pPr>
+      <w:r>
+        <w:rPr>
+          <w:b w:val="0"/>
+          <w:sz w:val="32"/>
+        </w:rPr>
+        <w:t>User Manual  v1.0.6</w:t>
+      </w:r>
+    </w:p>
+    <w:p>
+      <w:pPr>
+        <w:jc w:val="center"/>
+      </w:pPr>
+      <w:r>
+        <w:rPr>
+          <w:b w:val="0"/>
+          <w:sz w:val="24"/>
+        </w:rPr>
+        <w:t>June 4, 2026</w:t>
+      </w:r>
+    </w:p>
+    <w:p>
+      <w:pPr>
+        <w:jc w:val="center"/>
+      </w:pPr>
+      <w:r>
+        <w:rPr>
+          <w:b w:val="0"/>
+        </w:rPr>
+        <w:t>A Windows desktop application for inspecting DICOM medical imaging files.</w:t>
+      </w:r>
+    </w:p>
+    <w:p>
+      <w:pPr>
+        <w:jc w:val="center"/>
+        <w:sectPr>
+          <w:pgSz w:w="12240" w:h="15840"/>
+          <w:pgMar w:top="1440" w:right="1440" w:bottom="1440" w:left="1440" w:header="708" w:footer="708" w:gutter="0"/>
+          <w:vAlign w:val="center"/>
+        </w:sectPr>
+      </w:pPr>
+      <w:r>
+        <w:rPr>
+          <w:sz w:val="20"/>
+        </w:rPr>
+        <w:t>Image Response Assessment Team (IRAT)</w:t>
+      </w:r>
+      <w:r>
+        <w:br/>
+      </w:r>
+      <w:r>
+        <w:rPr>
+          <w:sz w:val="20"/>
+        </w:rPr>
+        <w:t>550 North Broadway, Suite 300</w:t>
+      </w:r>
+      <w:r>
+        <w:br/>
+      </w:r>
+      <w:r>
+        <w:rPr>
+          <w:sz w:val="20"/>
+        </w:rPr>
+        <w:t>The Sidney Kimmel Comprehensive Cancer Center</w:t>
+      </w:r>
+      <w:r>
+        <w:br/>
+      </w:r>
+      <w:r>
+        <w:rPr>
+          <w:sz w:val="20"/>
+        </w:rPr>
+        <w:t>The Johns Hopkins University School of Medicine</w:t>
+      </w:r>
+      <w:r>
+        <w:br/>
+      </w:r>
+      <w:r>
+        <w:rPr>
+          <w:sz w:val="20"/>
+        </w:rPr>
+        <w:t>Baltimore, MD 21205</w:t>
+      </w:r>
+    </w:p>
     <w:p>
       <w:pPr>
         <w:pStyle w:val="Heading1"/>
@@ -5877,11 +6001,68 @@
       </w:r>
     </w:p>
     <w:sectPr>
+      <w:headerReference w:type="default" r:id="rId5"/>
+      <w:footerReference w:type="default" r:id="rId6"/>
       <w:pgSz w:w="12240" w:h="15840"/>
       <w:pgMar w:top="1440" w:right="1440" w:bottom="1440" w:left="1440" w:header="708" w:footer="708" w:gutter="0"/>
     </w:sectPr>
   </w:body>
 </w:document>
+</file>
+
+<file path=word/footer1.xml><?xml version="1.0" encoding="utf-8"?>
+<w:ftr xmlns:m="http://schemas.openxmlformats.org/officeDocument/2006/math" xmlns:mc="http://schemas.openxmlformats.org/markup-compatibility/2006" xmlns:mo="http://schemas.microsoft.com/office/mac/office/2008/main" xmlns:mv="urn:schemas-microsoft-com:mac:vml" xmlns:o="urn:schemas-microsoft-com:office:office" xmlns:r="http://schemas.openxmlformats.org/officeDocument/2006/relationships" xmlns:v="urn:schemas-microsoft-com:vml" xmlns:w10="urn:schemas-microsoft-com:office:word" xmlns:w14="http://schemas.microsoft.com/office/word/2010/wordml" xmlns:w="http://schemas.openxmlformats.org/wordprocessingml/2006/main" xmlns:wne="http://schemas.microsoft.com/office/word/2006/wordml" xmlns:wp14="http://schemas.microsoft.com/office/word/2010/wordprocessingDrawing" xmlns:wp="http://schemas.openxmlformats.org/drawingml/2006/wordprocessingDrawing" xmlns:wpc="http://schemas.microsoft.com/office/word/2010/wordprocessingCanvas" xmlns:wpg="http://schemas.microsoft.com/office/word/2010/wordprocessingGroup" xmlns:wpi="http://schemas.microsoft.com/office/word/2010/wordprocessingInk" xmlns:wps="http://schemas.microsoft.com/office/word/2010/wordprocessingShape" mc:Ignorable="w14 wp14">
+  <w:p>
+    <w:pPr>
+      <w:pBdr>
+        <w:top w:val="single" w:sz="6" w:space="1" w:color="auto"/>
+      </w:pBdr>
+      <w:spacing w:after="0"/>
+      <w:jc w:val="left"/>
+    </w:pPr>
+    <w:r>
+      <w:rPr>
+        <w:sz w:val="16"/>
+        <w:szCs w:val="16"/>
+      </w:rPr>
+      <w:t>The IRAT Lab is supported by the National Institutes of Health/The National Cancer Institute P30CA006973</w:t>
+    </w:r>
+  </w:p>
+</w:ftr>
+</file>
+
+<file path=word/header1.xml><?xml version="1.0" encoding="utf-8"?>
+<w:hdr xmlns:m="http://schemas.openxmlformats.org/officeDocument/2006/math" xmlns:mc="http://schemas.openxmlformats.org/markup-compatibility/2006" xmlns:mo="http://schemas.microsoft.com/office/mac/office/2008/main" xmlns:mv="urn:schemas-microsoft-com:mac:vml" xmlns:o="urn:schemas-microsoft-com:office:office" xmlns:r="http://schemas.openxmlformats.org/officeDocument/2006/relationships" xmlns:v="urn:schemas-microsoft-com:vml" xmlns:w10="urn:schemas-microsoft-com:office:word" xmlns:w14="http://schemas.microsoft.com/office/word/2010/wordml" xmlns:w="http://schemas.openxmlformats.org/wordprocessingml/2006/main" xmlns:wne="http://schemas.microsoft.com/office/word/2006/wordml" xmlns:wp14="http://schemas.microsoft.com/office/word/2010/wordprocessingDrawing" xmlns:wp="http://schemas.openxmlformats.org/drawingml/2006/wordprocessingDrawing" xmlns:wpc="http://schemas.microsoft.com/office/word/2010/wordprocessingCanvas" xmlns:wpg="http://schemas.microsoft.com/office/word/2010/wordprocessingGroup" xmlns:wpi="http://schemas.microsoft.com/office/word/2010/wordprocessingInk" xmlns:wps="http://schemas.microsoft.com/office/word/2010/wordprocessingShape" mc:Ignorable="w14 wp14">
+  <w:p>
+    <w:pPr>
+      <w:pBdr>
+        <w:bottom w:val="single" w:sz="6" w:space="1" w:color="auto"/>
+      </w:pBdr>
+      <w:tabs>
+        <w:tab w:val="right" w:pos="9360"/>
+      </w:tabs>
+      <w:spacing w:after="0"/>
+    </w:pPr>
+    <w:r>
+      <w:t xml:space="preserve">dicomhdr</w:t>
+    </w:r>
+    <w:r>
+      <w:tab/>
+    </w:r>
+    <w:r>
+      <w:t xml:space="preserve">Page: </w:t>
+    </w:r>
+    <w:r>
+      <w:fldChar w:fldCharType="begin"/>
+    </w:r>
+    <w:r>
+      <w:instrText xml:space="preserve"> PAGE </w:instrText>
+    </w:r>
+    <w:r>
+      <w:fldChar w:fldCharType="end"/>
+    </w:r>
+  </w:p>
+</w:hdr>
 </file>
 
 <file path=word/numbering.xml><?xml version="1.0" encoding="utf-8"?>

</xml_diff>

<commit_message>
v1.0.8 -- date/time labels and chronological sort for study and series nodes
- Prepend study date [YYYY-MM-DD] to study node labels (Study Date 0008,0020)
- Prepend series time [HH:MM:SS] to series node labels (Series Time 0008,0031)
- Sort study nodes chronologically within each patient (earliest date first)
- Sort series nodes chronologically within each study (earliest time first)
- Nodes without date/time sort after all dated/timed nodes

Co-Authored-By: Claude Sonnet 4.6 <noreply@anthropic.com>
</commit_message>
<xml_diff>
--- a/dicomhdr-user-manual.docx
+++ b/dicomhdr-user-manual.docx
@@ -62,7 +62,7 @@
           <w:b w:val="0"/>
           <w:sz w:val="32"/>
         </w:rPr>
-        <w:t>User Manual  v1.0.7</w:t>
+        <w:t>User Manual  v1.0.8</w:t>
       </w:r>
     </w:p>
     <w:p>
@@ -74,7 +74,7 @@
           <w:b w:val="0"/>
           <w:sz w:val="24"/>
         </w:rPr>
-        <w:t>June 8, 2026</w:t>
+        <w:t>June 23, 2026</w:t>
       </w:r>
     </w:p>
     <w:p>
@@ -444,7 +444,17 @@
     <w:p/>
     <w:p>
       <w:r>
-        <w:t>Loaded files are organised hierarchically under four structural levels: Patient &gt; Study &gt; Series &gt; Instance. Each instance node contains the DICOM tags from that file. Instance nodes are labelled by their position within the series: dicomhdr determines the image plane from Image Orientation Patient (0020,0037) and shows the matching coordinate from Image Position Patient (0020,0032) — labelled Axial location, Sagittal location, or Coronal location accordingly. When orientation information is unavailable it falls back to Slice Location (0020,1041), and finally to Instance Number (0020,0013).</w:t>
+        <w:t>Loaded files are organised hierarchically under four structural levels: Patient &gt; Study &gt; Series &gt; Instance. Each instance node contains the DICOM tags from that file.</w:t>
+      </w:r>
+    </w:p>
+    <w:p>
+      <w:r>
+        <w:t>Study nodes are labelled [YYYY-MM-DD] Study Description, using Study Date (0008,0020), and are sorted chronologically (earliest first) within each patient. Studies with no Study Date appear after all dated studies. Series nodes are labelled [HH:MM:SS] Series Description, using Series Time (0008,0031), and are sorted chronologically within each study. Series with no Series Time appear after all timed series.</w:t>
+      </w:r>
+    </w:p>
+    <w:p>
+      <w:r>
+        <w:t>Instance nodes are labelled by their position within the series: dicomhdr determines the image plane from Image Orientation Patient (0020,0037) and shows the matching coordinate from Image Position Patient (0020,0032) – labelled Axial location, Sagittal location, or Coronal location accordingly. When orientation information is unavailable it falls back to Slice Location (0020,1041), and finally to Instance Number (0020,0013).</w:t>
       </w:r>
     </w:p>
     <w:p/>
@@ -2310,7 +2320,7 @@
           <w:b/>
           <w:bCs/>
         </w:rPr>
-        <w:t>Left side – shows v1.0.7 when no files are loaded. After files have been opened, this changes to Files loaded: N, where N is the count of successfully parsed files. If any files failed to load, the text additionally shows | Errors: M. Once a load finishes, the total load time is appended (for example, | loaded in 3.42 s).</w:t>
+        <w:t>Left side – shows v1.0.8 when no files are loaded. After files have been opened, this changes to Files loaded: N, where N is the count of successfully parsed files. If any files failed to load, the text additionally shows | Errors: M. Once a load finishes, the total load time is appended (for example, | loaded in 3.42 s).</w:t>
       </w:r>
       <w:r/>
       <w:r>

</xml_diff>